<commit_message>
Lab 6: personal level, layout-PDF maps, run evidence, placeholder example maps
Lab 5 grading showed three ways AI stands in for the work: published check
values make fabricated numbers undetectable, the example map is a reference
image for an image generator, and nothing in a report shows that ArcGIS Pro ran.
Lab 6 now asks for a personal elevation (3,500 + 2 x the BYU ID's last two
digits) with the pool area and shoreline length at it, checked against a private
oracle (tools/lab06/personal.py); both maps uploaded as ArcGIS Pro layout PDFs
with selectable text; Geoprocessing History and attribute-table captures; a
'what the grader verifies' note under the rubric; and example layouts whose
wording is all bracketed placeholders. The report template gains the matching
row, figure slot and checklist lines (tools/lab06/update_template.py).

Co-Authored-By: Claude Fable 5.1 <noreply@anthropic.com>
</commit_message>
<xml_diff>
--- a/docs/assignments/lab-06/lab06-report-template.docx
+++ b/docs/assignments/lab-06/lab06-report-template.docx
@@ -147,6 +147,30 @@
                 <w:szCs w:val="19"/>
               </w:rPr>
               <w:t xml:space="preserve">Save as PDF, then open the PDF and check that every figure and map came through readable.</w:t>
+            </w:r>
+          </w:p>
+          <w:p>
+            <w:pPr>
+              <w:pStyle w:val="ListParagraph"/>
+            </w:pPr>
+            <w:r>
+              <w:t>Upload three files: this report as a PDF, and each map as its own PDF exported from the ArcGIS Pro layout (Share ▸ Export Layout ▸ PDF). The grader checks that the map PDFs have selectable text.</w:t>
+            </w:r>
+          </w:p>
+          <w:p>
+            <w:pPr>
+              <w:pStyle w:val="ListParagraph"/>
+            </w:pPr>
+            <w:r>
+              <w:t>Section 3 holds your Geoprocessing History capture (Analysis ▸ History, showing your runs) and the attribute table of your baseline Shorelines.</w:t>
+            </w:r>
+          </w:p>
+          <w:p>
+            <w:pPr>
+              <w:pStyle w:val="ListParagraph"/>
+            </w:pPr>
+            <w:r>
+              <w:t>Table 4 has your personal-level row: your BYU ID's last two digits, the elevation they give, the main-pool area and its shoreline length.</w:t>
             </w:r>
           </w:p>
         </w:tc>
@@ -2129,6 +2153,23 @@
           <w:szCs w:val="19"/>
         </w:rPr>
         <w:t xml:space="preserve">Figure 2. The model’s toolbox interface, showing its parameters (at least From, To and By).</w:t>
+      </w:r>
+    </w:p>
+    <w:p>
+      <w:pPr>
+        <w:spacing w:after="240" w:before="100"/>
+      </w:pPr>
+      <w:r>
+        <w:t>Rubric: evidence that the model ran on your machine (part of the 4 points for a working model). Paste two screen captures: the Geoprocessing History pane (Analysis tab ▸ History) listing your model's runs with their dates and run times, and the attribute table of your baseline Shorelines feature class showing its rows with Elevation and AreaSqMi.</w:t>
+      </w:r>
+    </w:p>
+    <w:p>
+      <w:pPr>
+        <w:pStyle w:val="Caption"/>
+        <w:spacing w:after="240" w:before="100"/>
+      </w:pPr>
+      <w:r>
+        <w:t>Figure 3. Geoprocessing History and the baseline Shorelines attribute table.</w:t>
       </w:r>
     </w:p>
     <w:p>
@@ -3190,6 +3231,151 @@
                 <w:szCs w:val="15"/>
               </w:rPr>
               <w:t xml:space="preserve">What it shows</w:t>
+            </w:r>
+          </w:p>
+        </w:tc>
+      </w:tr>
+      <w:tr>
+        <w:trPr>
+          <w:cantSplit/>
+        </w:trPr>
+        <w:tc>
+          <w:tcPr>
+            <w:tcW w:type="dxa" w:w="1200"/>
+            <w:tcMar>
+              <w:top w:type="dxa" w:w="90"/>
+              <w:left w:type="dxa" w:w="120"/>
+              <w:bottom w:type="dxa" w:w="90"/>
+              <w:right w:type="dxa" w:w="120"/>
+            </w:tcMar>
+          </w:tcPr>
+          <w:p>
+            <w:r>
+              <w:t>Personal level: BYU ID digits __, E = 3,500 + 2 × __ = ____ ft</w:t>
+            </w:r>
+          </w:p>
+        </w:tc>
+        <w:tc>
+          <w:tcPr>
+            <w:tcW w:type="dxa" w:w="700"/>
+            <w:tcMar>
+              <w:top w:type="dxa" w:w="90"/>
+              <w:left w:type="dxa" w:w="120"/>
+              <w:bottom w:type="dxa" w:w="90"/>
+              <w:right w:type="dxa" w:w="120"/>
+            </w:tcMar>
+          </w:tcPr>
+          <w:p>
+            <w:r>
+              <w:t>E</w:t>
+            </w:r>
+          </w:p>
+        </w:tc>
+        <w:tc>
+          <w:tcPr>
+            <w:tcW w:type="dxa" w:w="700"/>
+            <w:tcMar>
+              <w:top w:type="dxa" w:w="90"/>
+              <w:left w:type="dxa" w:w="120"/>
+              <w:bottom w:type="dxa" w:w="90"/>
+              <w:right w:type="dxa" w:w="120"/>
+            </w:tcMar>
+          </w:tcPr>
+          <w:p>
+            <w:r>
+              <w:t>E</w:t>
+            </w:r>
+          </w:p>
+        </w:tc>
+        <w:tc>
+          <w:tcPr>
+            <w:tcW w:type="dxa" w:w="650"/>
+            <w:tcMar>
+              <w:top w:type="dxa" w:w="90"/>
+              <w:left w:type="dxa" w:w="120"/>
+              <w:bottom w:type="dxa" w:w="90"/>
+              <w:right w:type="dxa" w:w="120"/>
+            </w:tcMar>
+          </w:tcPr>
+          <w:p>
+            <w:r>
+              <w:t>any</w:t>
+            </w:r>
+          </w:p>
+        </w:tc>
+        <w:tc>
+          <w:tcPr>
+            <w:tcW w:type="dxa" w:w="1000"/>
+            <w:tcMar>
+              <w:top w:type="dxa" w:w="90"/>
+              <w:left w:type="dxa" w:w="120"/>
+              <w:bottom w:type="dxa" w:w="90"/>
+              <w:right w:type="dxa" w:w="120"/>
+            </w:tcMar>
+          </w:tcPr>
+          <w:p>
+            <w:r>
+              <w:t>1</w:t>
+            </w:r>
+          </w:p>
+        </w:tc>
+        <w:tc>
+          <w:tcPr>
+            <w:tcW w:type="dxa" w:w="1100"/>
+            <w:tcMar>
+              <w:top w:type="dxa" w:w="90"/>
+              <w:left w:type="dxa" w:w="120"/>
+              <w:bottom w:type="dxa" w:w="90"/>
+              <w:right w:type="dxa" w:w="120"/>
+            </w:tcMar>
+          </w:tcPr>
+          <w:p>
+            <w:r/>
+          </w:p>
+        </w:tc>
+        <w:tc>
+          <w:tcPr>
+            <w:tcW w:type="dxa" w:w="1100"/>
+            <w:tcMar>
+              <w:top w:type="dxa" w:w="90"/>
+              <w:left w:type="dxa" w:w="120"/>
+              <w:bottom w:type="dxa" w:w="90"/>
+              <w:right w:type="dxa" w:w="120"/>
+            </w:tcMar>
+          </w:tcPr>
+          <w:p>
+            <w:r>
+              <w:t>same</w:t>
+            </w:r>
+          </w:p>
+        </w:tc>
+        <w:tc>
+          <w:tcPr>
+            <w:tcW w:type="dxa" w:w="960"/>
+            <w:tcMar>
+              <w:top w:type="dxa" w:w="90"/>
+              <w:left w:type="dxa" w:w="120"/>
+              <w:bottom w:type="dxa" w:w="90"/>
+              <w:right w:type="dxa" w:w="120"/>
+            </w:tcMar>
+          </w:tcPr>
+          <w:p>
+            <w:r/>
+          </w:p>
+        </w:tc>
+        <w:tc>
+          <w:tcPr>
+            <w:tcW w:type="dxa" w:w="1950"/>
+            <w:tcMar>
+              <w:top w:type="dxa" w:w="90"/>
+              <w:left w:type="dxa" w:w="120"/>
+              <w:bottom w:type="dxa" w:w="90"/>
+              <w:right w:type="dxa" w:w="120"/>
+            </w:tcMar>
+          </w:tcPr>
+          <w:p>
+            <w:r>
+              <w:t>shoreline length at E: ______ m</w:t>
             </w:r>
           </w:p>
         </w:tc>

</xml_diff>

<commit_message>
Lab 6 scope cuts; Week 7 decks lose divider slides and gain the depth-explorer link
Lab 6: the dead-pool run and the Map 1 inset are optional, two shore features
instead of three, Step 7's three questions become two; rubric reweighted
(Map 1 shorelines 3, points 2; sensitivity 4+3+3) and the template updated
to match. Decks: section-divider slides removed (tools/drop_lead_slides.py
carries their notes to the next slide); Tuesday gets 'The Tool You Are About
to Build' linking the Great Salt Lake and Lake Powell depth explorers;
Thursday's example-map slide uses the placeholder copy.

Co-Authored-By: Claude Fable 5.1 <noreply@anthropic.com>
</commit_message>
<xml_diff>
--- a/docs/assignments/lab-06/lab06-report-template.docx
+++ b/docs/assignments/lab-06/lab06-report-template.docx
@@ -2966,14 +2966,7 @@
         <w:spacing w:after="160" w:before="60"/>
       </w:pPr>
       <w:r>
-        <w:rPr>
-          <w:i/>
-          <w:iCs/>
-          <w:color w:val="767171"/>
-          <w:sz w:val="19"/>
-          <w:szCs w:val="19"/>
-        </w:rPr>
-        <w:t xml:space="preserve">Rubric: one table with the baseline and at least three additional runs, giving the range, the step, the number of shorelines, the areas at the lowest and highest elevations, and the run time for each (4 points). Choose your values deliberately and say why. The run time is the Elapsed Time in the pop-up when a run finishes.</w:t>
+        <w:t>Rubric: one table with the baseline and at least two additional runs, giving the range, the step, the number of shorelines, the areas at the lowest and highest elevations, and the run time for each (4 points). Choose your values deliberately and say why. The run time is the Elapsed Time in the pop-up when a run finishes.</w:t>
       </w:r>
     </w:p>
     <w:p>
@@ -4181,14 +4174,7 @@
         <w:spacing w:after="240" w:before="100"/>
       </w:pPr>
       <w:r>
-        <w:rPr>
-          <w:b/>
-          <w:bCs/>
-          <w:color w:val="1F3864"/>
-          <w:sz w:val="19"/>
-          <w:szCs w:val="19"/>
-        </w:rPr>
-        <w:t xml:space="preserve">Table 4. Range and step sensitivity — the baseline and at least three more runs.</w:t>
+        <w:t>Table 4. Range and step sensitivity — the baseline and at least two more runs.</w:t>
       </w:r>
     </w:p>
     <w:p>
@@ -4197,14 +4183,7 @@
         <w:spacing w:after="60" w:before="220"/>
       </w:pPr>
       <w:r>
-        <w:rPr>
-          <w:b/>
-          <w:bCs/>
-          <w:color w:val="1F3864"/>
-          <w:sz w:val="22"/>
-          <w:szCs w:val="22"/>
-        </w:rPr>
-        <w:t xml:space="preserve">Which shore features go dry, and at what elevation? Does the answer change with the step, and if so, how far? (2 points)</w:t>
+        <w:t>Which shore features go dry, and at what elevation? Does the answer change with the step, and if so, how far? (3 points)</w:t>
       </w:r>
     </w:p>
     <w:p>
@@ -4227,44 +4206,7 @@
         <w:spacing w:after="60" w:before="220"/>
       </w:pPr>
       <w:r>
-        <w:rPr>
-          <w:b/>
-          <w:bCs/>
-          <w:color w:val="1F3864"/>
-          <w:sz w:val="22"/>
-          <w:szCs w:val="22"/>
-        </w:rPr>
-        <w:t xml:space="preserve">How much does the lake’s area change per unit of elevation, and is that rate the same at the bottom of the range as at the top? What about the basin’s shape explains the difference? (2 points)</w:t>
-      </w:r>
-    </w:p>
-    <w:p>
-      <w:pPr>
-        <w:spacing w:after="260" w:before="0"/>
-      </w:pPr>
-      <w:r>
-        <w:rPr>
-          <w:i/>
-          <w:iCs/>
-          <w:color w:val="767171"/>
-          <w:highlight w:val="yellow"/>
-        </w:rPr>
-        <w:t xml:space="preserve">[Your answer here.]</w:t>
-      </w:r>
-    </w:p>
-    <w:p>
-      <w:pPr>
-        <w:pStyle w:val="Heading2"/>
-        <w:spacing w:after="60" w:before="220"/>
-      </w:pPr>
-      <w:r>
-        <w:rPr>
-          <w:b/>
-          <w:bCs/>
-          <w:color w:val="1F3864"/>
-          <w:sz w:val="22"/>
-          <w:szCs w:val="22"/>
-        </w:rPr>
-        <w:t xml:space="preserve">What is the smallest step that still shows the shape of the basin? What did the finer runs cost? (2 points)</w:t>
+        <w:t>How much does the lake's area change per unit of elevation, and is that rate the same at the bottom of the range as at the top? What about the basin's shape explains the difference, what is the smallest step that still shows that shape, and what did the finer run cost? (3 points)</w:t>
       </w:r>
     </w:p>
     <w:p>
@@ -4367,14 +4309,7 @@
         <w:spacing w:after="160" w:before="60"/>
       </w:pPr>
       <w:r>
-        <w:rPr>
-          <w:i/>
-          <w:iCs/>
-          <w:color w:val="767171"/>
-          <w:sz w:val="19"/>
-          <w:szCs w:val="19"/>
-        </w:rPr>
-        <w:t xml:space="preserve">Must carry: title stating the elevation range and step; neat line, north arrow and scale bar; a text box with author, date, map projection, and the surface’s source, survey date and vertical datum; the nested shorelines symbolized so each elevation is readable, with a legend; your shore-feature points, labeled; an inset or close-up of one feature at the elevation it goes dry; basemap, scale and legibility appropriate to the lake.</w:t>
+        <w:t>Must carry: title stating the elevation range and step; neat line, north arrow and scale bar; a text box with author, date, map projection, and the surface's source, survey date and vertical datum; the nested shorelines symbolized so each elevation is readable, with a legend and a few levels labeled on the map; your shore-feature points, labeled; basemap, scale and legibility appropriate to the lake. An inset of one feature at the level it goes dry is optional.</w:t>
       </w:r>
     </w:p>
     <w:tbl>
@@ -4448,14 +4383,7 @@
         <w:spacing w:after="160" w:before="60"/>
       </w:pPr>
       <w:r>
-        <w:rPr>
-          <w:i/>
-          <w:iCs/>
-          <w:color w:val="767171"/>
-          <w:sz w:val="19"/>
-          <w:szCs w:val="19"/>
-        </w:rPr>
-        <w:t xml:space="preserve">Everything Map 1 needs except the inset, plus: the title and text box say what changed from Map 1 and why this run was chosen.</w:t>
+        <w:t>Everything Map 1 needs, plus: the title and text box say what changed from Map 1 and why this run was chosen.</w:t>
       </w:r>
     </w:p>
     <w:tbl>

</xml_diff>